<commit_message>
Add MikTex installer with LFS
</commit_message>
<xml_diff>
--- a/archive/ios_ömer.docx
+++ b/archive/ios_ömer.docx
@@ -96,27 +96,7 @@
           <w:sz w:val="32"/>
           <w:szCs w:val="32"/>
         </w:rPr>
-        <w:t>BLM</w:t>
-      </w:r>
-      <w:proofErr w:type="gramStart"/>
-      <w:r>
-        <w:rPr>
-          <w:b/>
-          <w:bCs/>
-          <w:sz w:val="32"/>
-          <w:szCs w:val="32"/>
-        </w:rPr>
-        <w:t>4537 -</w:t>
-      </w:r>
-      <w:proofErr w:type="gramEnd"/>
-      <w:r>
-        <w:rPr>
-          <w:b/>
-          <w:bCs/>
-          <w:sz w:val="32"/>
-          <w:szCs w:val="32"/>
-        </w:rPr>
-        <w:t xml:space="preserve"> IOS İle Mobil Uygulama Geliştirme I</w:t>
+        <w:t xml:space="preserve">BLM4537 - IOS İle Mobil Uygulama Geliştirme </w:t>
       </w:r>
       <w:r>
         <w:rPr>
@@ -217,6 +197,18 @@
         </w:rPr>
         <w:t xml:space="preserve">: </w:t>
       </w:r>
+      <w:hyperlink r:id="rId5" w:history="1">
+        <w:r>
+          <w:rPr>
+            <w:rStyle w:val="Kpr"/>
+            <w:b/>
+            <w:bCs/>
+            <w:sz w:val="32"/>
+            <w:szCs w:val="32"/>
+          </w:rPr>
+          <w:t>https://github.com/bycycomr</w:t>
+        </w:r>
+      </w:hyperlink>
       <w:r>
         <w:rPr>
           <w:b/>
@@ -224,8 +216,19 @@
           <w:sz w:val="32"/>
           <w:szCs w:val="32"/>
         </w:rPr>
-        <w:t>https://github.com/bycycomr</w:t>
+        <w:br/>
       </w:r>
+      <w:hyperlink r:id="rId6" w:history="1">
+        <w:r>
+          <w:rPr>
+            <w:rStyle w:val="Kpr"/>
+            <w:rFonts w:ascii="Times New Roman" w:eastAsia="Times New Roman" w:hAnsi="Times New Roman" w:cs="Times New Roman"/>
+            <w:sz w:val="32"/>
+            <w:szCs w:val="32"/>
+          </w:rPr>
+          <w:t>https://www.youtube.com/watch?v=DfSqHaIYX6Y</w:t>
+        </w:r>
+      </w:hyperlink>
     </w:p>
     <w:p>
       <w:pPr>
@@ -8674,6 +8677,7 @@
   <w:style w:type="character" w:default="1" w:styleId="VarsaylanParagrafYazTipi">
     <w:name w:val="Default Paragraph Font"/>
     <w:uiPriority w:val="1"/>
+    <w:semiHidden/>
     <w:unhideWhenUsed/>
   </w:style>
   <w:style w:type="table" w:default="1" w:styleId="NormalTablo">
@@ -8987,6 +8991,29 @@
       <w:spacing w:val="5"/>
     </w:rPr>
   </w:style>
+  <w:style w:type="character" w:styleId="Kpr">
+    <w:name w:val="Hyperlink"/>
+    <w:basedOn w:val="VarsaylanParagrafYazTipi"/>
+    <w:uiPriority w:val="99"/>
+    <w:unhideWhenUsed/>
+    <w:rsid w:val="00D04EFE"/>
+    <w:rPr>
+      <w:color w:val="0563C1" w:themeColor="hyperlink"/>
+      <w:u w:val="single"/>
+    </w:rPr>
+  </w:style>
+  <w:style w:type="character" w:styleId="zmlenmeyenBahsetme">
+    <w:name w:val="Unresolved Mention"/>
+    <w:basedOn w:val="VarsaylanParagrafYazTipi"/>
+    <w:uiPriority w:val="99"/>
+    <w:semiHidden/>
+    <w:unhideWhenUsed/>
+    <w:rsid w:val="00D04EFE"/>
+    <w:rPr>
+      <w:color w:val="605E5C"/>
+      <w:shd w:val="clear" w:color="auto" w:fill="E1DFDD"/>
+    </w:rPr>
+  </w:style>
 </w:styles>
 </file>
 

</xml_diff>